<commit_message>
Replace the verification screenshot with the clean capture and finalise the report name
</commit_message>
<xml_diff>
--- a/Work1_Report_Wu_Yiye.docx
+++ b/Work1_Report_Wu_Yiye.docx
@@ -2323,8 +2323,42 @@
       </w:r>
     </w:p>
     <w:p>
+      <w:pPr>
+        <w:jc w:val="center"/>
+      </w:pPr>
       <w:r>
-        <w:t>[Placeholder: insert here a screenshot of the two curl commands above, showing HTTP 200 and the /etc/passwd content.]</w:t>
+        <w:drawing>
+          <wp:inline xmlns:a="http://schemas.openxmlformats.org/drawingml/2006/main" xmlns:pic="http://schemas.openxmlformats.org/drawingml/2006/picture">
+            <wp:extent cx="5580000" cy="5082172"/>
+            <wp:docPr id="6" name="Picture 6"/>
+            <wp:cNvGraphicFramePr>
+              <a:graphicFrameLocks noChangeAspect="1"/>
+            </wp:cNvGraphicFramePr>
+            <a:graphic>
+              <a:graphicData uri="http://schemas.openxmlformats.org/drawingml/2006/picture">
+                <pic:pic>
+                  <pic:nvPicPr>
+                    <pic:cNvPr id="0" name="cve-vuln.png"/>
+                    <pic:cNvPicPr/>
+                  </pic:nvPicPr>
+                  <pic:blipFill>
+                    <a:blip r:embed="rId14"/>
+                    <a:stretch>
+                      <a:fillRect/>
+                    </a:stretch>
+                  </pic:blipFill>
+                  <pic:spPr>
+                    <a:xfrm>
+                      <a:off x="0" y="0"/>
+                      <a:ext cx="5580000" cy="5082172"/>
+                    </a:xfrm>
+                    <a:prstGeom prst="rect"/>
+                  </pic:spPr>
+                </pic:pic>
+              </a:graphicData>
+            </a:graphic>
+          </wp:inline>
+        </w:drawing>
       </w:r>
     </w:p>
     <w:p>
@@ -2676,8 +2710,42 @@
       </w:r>
     </w:p>
     <w:p>
+      <w:pPr>
+        <w:jc w:val="center"/>
+      </w:pPr>
       <w:r>
-        <w:t>[Placeholder: insert here a screenshot of the same two curl commands returning 404 after the upgrade, and of the /api/health output showing version 8.3.1.]</w:t>
+        <w:drawing>
+          <wp:inline xmlns:a="http://schemas.openxmlformats.org/drawingml/2006/main" xmlns:pic="http://schemas.openxmlformats.org/drawingml/2006/picture">
+            <wp:extent cx="5580000" cy="3354539"/>
+            <wp:docPr id="7" name="Picture 7"/>
+            <wp:cNvGraphicFramePr>
+              <a:graphicFrameLocks noChangeAspect="1"/>
+            </wp:cNvGraphicFramePr>
+            <a:graphic>
+              <a:graphicData uri="http://schemas.openxmlformats.org/drawingml/2006/picture">
+                <pic:pic>
+                  <pic:nvPicPr>
+                    <pic:cNvPr id="0" name="cve-fixed.png"/>
+                    <pic:cNvPicPr/>
+                  </pic:nvPicPr>
+                  <pic:blipFill>
+                    <a:blip r:embed="rId15"/>
+                    <a:stretch>
+                      <a:fillRect/>
+                    </a:stretch>
+                  </pic:blipFill>
+                  <pic:spPr>
+                    <a:xfrm>
+                      <a:off x="0" y="0"/>
+                      <a:ext cx="5580000" cy="3354539"/>
+                    </a:xfrm>
+                    <a:prstGeom prst="rect"/>
+                  </pic:spPr>
+                </pic:pic>
+              </a:graphicData>
+            </a:graphic>
+          </wp:inline>
+        </w:drawing>
       </w:r>
     </w:p>
     <w:p>

</xml_diff>